<commit_message>
done phan 2 bai 5
</commit_message>
<xml_diff>
--- a/Tuan_04/Phan_02/MinhChung.docx
+++ b/Tuan_04/Phan_02/MinhChung.docx
@@ -12,6 +12,9 @@
     </w:p>
     <w:p>
       <w:r>
+        <w:rPr>
+          <w:noProof/>
+        </w:rPr>
         <w:drawing>
           <wp:inline distT="0" distB="0" distL="0" distR="0" wp14:anchorId="0937EB96" wp14:editId="702376CD">
             <wp:extent cx="5943600" cy="3343275"/>
@@ -59,6 +62,9 @@
     </w:p>
     <w:p>
       <w:r>
+        <w:rPr>
+          <w:noProof/>
+        </w:rPr>
         <w:drawing>
           <wp:inline distT="0" distB="0" distL="0" distR="0" wp14:anchorId="1581893F" wp14:editId="645712F8">
             <wp:extent cx="5943600" cy="3343275"/>
@@ -98,6 +104,9 @@
     </w:p>
     <w:p>
       <w:r>
+        <w:rPr>
+          <w:noProof/>
+        </w:rPr>
         <w:lastRenderedPageBreak/>
         <w:drawing>
           <wp:inline distT="0" distB="0" distL="0" distR="0" wp14:anchorId="4AA72C43" wp14:editId="38B64472">
@@ -146,6 +155,9 @@
     </w:p>
     <w:p>
       <w:r>
+        <w:rPr>
+          <w:noProof/>
+        </w:rPr>
         <w:drawing>
           <wp:inline distT="0" distB="0" distL="0" distR="0" wp14:anchorId="0D7A0C5E" wp14:editId="3D23BA29">
             <wp:extent cx="5943600" cy="3345180"/>
@@ -191,13 +203,209 @@
         <w:t>:</w:t>
       </w:r>
     </w:p>
-    <w:p/>
+    <w:p>
+      <w:r>
+        <w:drawing>
+          <wp:inline distT="0" distB="0" distL="0" distR="0" wp14:anchorId="6C659333" wp14:editId="6F4D3F2D">
+            <wp:extent cx="5943600" cy="1478915"/>
+            <wp:effectExtent l="0" t="0" r="0" b="6985"/>
+            <wp:docPr id="6" name="Picture 6"/>
+            <wp:cNvGraphicFramePr>
+              <a:graphicFrameLocks xmlns:a="http://schemas.openxmlformats.org/drawingml/2006/main" noChangeAspect="1"/>
+            </wp:cNvGraphicFramePr>
+            <a:graphic xmlns:a="http://schemas.openxmlformats.org/drawingml/2006/main">
+              <a:graphicData uri="http://schemas.openxmlformats.org/drawingml/2006/picture">
+                <pic:pic xmlns:pic="http://schemas.openxmlformats.org/drawingml/2006/picture">
+                  <pic:nvPicPr>
+                    <pic:cNvPr id="1" name=""/>
+                    <pic:cNvPicPr/>
+                  </pic:nvPicPr>
+                  <pic:blipFill>
+                    <a:blip r:embed="rId8"/>
+                    <a:stretch>
+                      <a:fillRect/>
+                    </a:stretch>
+                  </pic:blipFill>
+                  <pic:spPr>
+                    <a:xfrm>
+                      <a:off x="0" y="0"/>
+                      <a:ext cx="5943600" cy="1478915"/>
+                    </a:xfrm>
+                    <a:prstGeom prst="rect">
+                      <a:avLst/>
+                    </a:prstGeom>
+                  </pic:spPr>
+                </pic:pic>
+              </a:graphicData>
+            </a:graphic>
+          </wp:inline>
+        </w:drawing>
+      </w:r>
+    </w:p>
+    <w:p>
+      <w:r>
+        <w:lastRenderedPageBreak/>
+        <w:drawing>
+          <wp:inline distT="0" distB="0" distL="0" distR="0" wp14:anchorId="0909C1DB" wp14:editId="5BAA3509">
+            <wp:extent cx="5943600" cy="2291080"/>
+            <wp:effectExtent l="0" t="0" r="0" b="0"/>
+            <wp:docPr id="3" name="Picture 3"/>
+            <wp:cNvGraphicFramePr>
+              <a:graphicFrameLocks xmlns:a="http://schemas.openxmlformats.org/drawingml/2006/main" noChangeAspect="1"/>
+            </wp:cNvGraphicFramePr>
+            <a:graphic xmlns:a="http://schemas.openxmlformats.org/drawingml/2006/main">
+              <a:graphicData uri="http://schemas.openxmlformats.org/drawingml/2006/picture">
+                <pic:pic xmlns:pic="http://schemas.openxmlformats.org/drawingml/2006/picture">
+                  <pic:nvPicPr>
+                    <pic:cNvPr id="1" name=""/>
+                    <pic:cNvPicPr/>
+                  </pic:nvPicPr>
+                  <pic:blipFill>
+                    <a:blip r:embed="rId9"/>
+                    <a:stretch>
+                      <a:fillRect/>
+                    </a:stretch>
+                  </pic:blipFill>
+                  <pic:spPr>
+                    <a:xfrm>
+                      <a:off x="0" y="0"/>
+                      <a:ext cx="5943600" cy="2291080"/>
+                    </a:xfrm>
+                    <a:prstGeom prst="rect">
+                      <a:avLst/>
+                    </a:prstGeom>
+                  </pic:spPr>
+                </pic:pic>
+              </a:graphicData>
+            </a:graphic>
+          </wp:inline>
+        </w:drawing>
+      </w:r>
+    </w:p>
     <w:p>
       <w:r>
         <w:t xml:space="preserve">Câu 5 </w:t>
       </w:r>
       <w:r>
         <w:t>:</w:t>
+      </w:r>
+    </w:p>
+    <w:p>
+      <w:r>
+        <w:drawing>
+          <wp:inline distT="0" distB="0" distL="0" distR="0" wp14:anchorId="66204DC1" wp14:editId="01A4AB3F">
+            <wp:extent cx="5943600" cy="835025"/>
+            <wp:effectExtent l="0" t="0" r="0" b="3175"/>
+            <wp:docPr id="7" name="Picture 7"/>
+            <wp:cNvGraphicFramePr>
+              <a:graphicFrameLocks xmlns:a="http://schemas.openxmlformats.org/drawingml/2006/main" noChangeAspect="1"/>
+            </wp:cNvGraphicFramePr>
+            <a:graphic xmlns:a="http://schemas.openxmlformats.org/drawingml/2006/main">
+              <a:graphicData uri="http://schemas.openxmlformats.org/drawingml/2006/picture">
+                <pic:pic xmlns:pic="http://schemas.openxmlformats.org/drawingml/2006/picture">
+                  <pic:nvPicPr>
+                    <pic:cNvPr id="1" name=""/>
+                    <pic:cNvPicPr/>
+                  </pic:nvPicPr>
+                  <pic:blipFill>
+                    <a:blip r:embed="rId10"/>
+                    <a:stretch>
+                      <a:fillRect/>
+                    </a:stretch>
+                  </pic:blipFill>
+                  <pic:spPr>
+                    <a:xfrm>
+                      <a:off x="0" y="0"/>
+                      <a:ext cx="5943600" cy="835025"/>
+                    </a:xfrm>
+                    <a:prstGeom prst="rect">
+                      <a:avLst/>
+                    </a:prstGeom>
+                  </pic:spPr>
+                </pic:pic>
+              </a:graphicData>
+            </a:graphic>
+          </wp:inline>
+        </w:drawing>
+      </w:r>
+    </w:p>
+    <w:p>
+      <w:r>
+        <w:drawing>
+          <wp:inline distT="0" distB="0" distL="0" distR="0" wp14:anchorId="46E15965" wp14:editId="0607E454">
+            <wp:extent cx="5943600" cy="3343275"/>
+            <wp:effectExtent l="0" t="0" r="0" b="9525"/>
+            <wp:docPr id="9" name="Picture 9"/>
+            <wp:cNvGraphicFramePr>
+              <a:graphicFrameLocks xmlns:a="http://schemas.openxmlformats.org/drawingml/2006/main" noChangeAspect="1"/>
+            </wp:cNvGraphicFramePr>
+            <a:graphic xmlns:a="http://schemas.openxmlformats.org/drawingml/2006/main">
+              <a:graphicData uri="http://schemas.openxmlformats.org/drawingml/2006/picture">
+                <pic:pic xmlns:pic="http://schemas.openxmlformats.org/drawingml/2006/picture">
+                  <pic:nvPicPr>
+                    <pic:cNvPr id="1" name=""/>
+                    <pic:cNvPicPr/>
+                  </pic:nvPicPr>
+                  <pic:blipFill>
+                    <a:blip r:embed="rId11"/>
+                    <a:stretch>
+                      <a:fillRect/>
+                    </a:stretch>
+                  </pic:blipFill>
+                  <pic:spPr>
+                    <a:xfrm>
+                      <a:off x="0" y="0"/>
+                      <a:ext cx="5943600" cy="3343275"/>
+                    </a:xfrm>
+                    <a:prstGeom prst="rect">
+                      <a:avLst/>
+                    </a:prstGeom>
+                  </pic:spPr>
+                </pic:pic>
+              </a:graphicData>
+            </a:graphic>
+          </wp:inline>
+        </w:drawing>
+      </w:r>
+    </w:p>
+    <w:p>
+      <w:r>
+        <w:lastRenderedPageBreak/>
+        <w:drawing>
+          <wp:inline distT="0" distB="0" distL="0" distR="0" wp14:anchorId="519EE918" wp14:editId="4208F4C0">
+            <wp:extent cx="5943600" cy="1727200"/>
+            <wp:effectExtent l="0" t="0" r="0" b="6350"/>
+            <wp:docPr id="8" name="Picture 8"/>
+            <wp:cNvGraphicFramePr>
+              <a:graphicFrameLocks xmlns:a="http://schemas.openxmlformats.org/drawingml/2006/main" noChangeAspect="1"/>
+            </wp:cNvGraphicFramePr>
+            <a:graphic xmlns:a="http://schemas.openxmlformats.org/drawingml/2006/main">
+              <a:graphicData uri="http://schemas.openxmlformats.org/drawingml/2006/picture">
+                <pic:pic xmlns:pic="http://schemas.openxmlformats.org/drawingml/2006/picture">
+                  <pic:nvPicPr>
+                    <pic:cNvPr id="1" name=""/>
+                    <pic:cNvPicPr/>
+                  </pic:nvPicPr>
+                  <pic:blipFill>
+                    <a:blip r:embed="rId12"/>
+                    <a:stretch>
+                      <a:fillRect/>
+                    </a:stretch>
+                  </pic:blipFill>
+                  <pic:spPr>
+                    <a:xfrm>
+                      <a:off x="0" y="0"/>
+                      <a:ext cx="5943600" cy="1727200"/>
+                    </a:xfrm>
+                    <a:prstGeom prst="rect">
+                      <a:avLst/>
+                    </a:prstGeom>
+                  </pic:spPr>
+                </pic:pic>
+              </a:graphicData>
+            </a:graphic>
+          </wp:inline>
+        </w:drawing>
       </w:r>
     </w:p>
     <w:p>
@@ -853,6 +1061,7 @@
   <w:style w:type="character" w:default="1" w:styleId="DefaultParagraphFont">
     <w:name w:val="Default Paragraph Font"/>
     <w:uiPriority w:val="1"/>
+    <w:semiHidden/>
     <w:unhideWhenUsed/>
   </w:style>
   <w:style w:type="table" w:default="1" w:styleId="TableNormal">

</xml_diff>